<commit_message>
fix: Figure 1 framework diagram + 5 logic issues — Fig1 now shows Sentiment→Returns path, H3 wording, B-S caveat, §6.9 framing, abstract update
</commit_message>
<xml_diff>
--- a/presentation_v10.3/Words_Beyond_the_Rate_v10.3_updated.docx
+++ b/presentation_v10.3/Words_Beyond_the_Rate_v10.3_updated.docx
@@ -205,7 +205,24 @@
         <w:t xml:space="preserve">First</w:t>
       </w:r>
       <w:r>
-        <w:t xml:space="preserve">, target shocks are more consistently associated with FOMC statement sentiment than path shocks. The target coefficient is statistically significant in baseline specifications, while the path coefficient is generally weaker and more sensitive to specification. Although formal coefficient-equality tests cannot statistically reject equal effects, the overall evidence provides more support for the policy-implementation interpretation than for a strong informational-revelation interpretation.</w:t>
+        <w:t xml:space="preserve">, target shocks are more consistently associated with FOMC statement sentiment than path shocks. The target coefficient is statistically significant in baseline specifications, while the path coefficient is generally weaker and more sensitive to specification. Although a formal Wald test cannot reject coefficient equality (</w:t>
+      </w:r>
+      <m:oMath>
+        <m:r>
+          <m:t>p</m:t>
+        </m:r>
+        <m:r>
+          <m:rPr>
+            <m:sty m:val="p"/>
+          </m:rPr>
+          <m:t>=</m:t>
+        </m:r>
+        <m:r>
+          <m:t>0.90</m:t>
+        </m:r>
+      </m:oMath>
+      <w:r>
+        <w:t xml:space="preserve">), the asymmetry is consistent across specifications: the target shock reaches conventional significance levels while the path shock does not. This pattern provides more support for the policy-implementation interpretation than for a strong informational-revelation interpretation, though the Wald test result counsels against overstatement of the target–path distinction.</w:t>
       </w:r>
     </w:p>
     <w:p>
@@ -235,7 +252,62 @@
         <w:t xml:space="preserve">Third</w:t>
       </w:r>
       <w:r>
-        <w:t xml:space="preserve">, evidence supporting a strong forward-guidance sentiment channel is comparatively limited in daily-frequency specifications. Treasury and forward-guidance-related effects are generally weaker and less stable than equity responses.</w:t>
+        <w:t xml:space="preserve">, while the forward-guidance interaction with path shocks is not significant, statement sentiment itself has substantial incremental explanatory power for equity returns during the forward guidance period (</w:t>
+      </w:r>
+      <m:oMath>
+        <m:sSup>
+          <m:e>
+            <m:r>
+              <m:t>R</m:t>
+            </m:r>
+          </m:e>
+          <m:sup>
+            <m:r>
+              <m:t>2</m:t>
+            </m:r>
+          </m:sup>
+        </m:sSup>
+        <m:r>
+          <m:rPr>
+            <m:sty m:val="p"/>
+          </m:rPr>
+          <m:t>=</m:t>
+        </m:r>
+        <m:r>
+          <m:t>30.6</m:t>
+        </m:r>
+        <m:r>
+          <m:rPr>
+            <m:sty m:val="p"/>
+          </m:rPr>
+          <m:t>%</m:t>
+        </m:r>
+      </m:oMath>
+      <w:r>
+        <w:t xml:space="preserve"> </w:t>
+      </w:r>
+      <w:r>
+        <w:t xml:space="preserve">for CRSP VW returns,</w:t>
+      </w:r>
+      <w:r>
+        <w:t xml:space="preserve"> </w:t>
+      </w:r>
+      <m:oMath>
+        <m:r>
+          <m:t>p</m:t>
+        </m:r>
+        <m:r>
+          <m:rPr>
+            <m:sty m:val="p"/>
+          </m:rPr>
+          <m:t>=</m:t>
+        </m:r>
+        <m:r>
+          <m:t>0.004</m:t>
+        </m:r>
+      </m:oMath>
+      <w:r>
+        <w:t xml:space="preserve">), suggesting that language becomes the primary transmission channel when the conventional interest-rate tool is constrained at the zero lower bound.</w:t>
       </w:r>
     </w:p>
     <w:p>
@@ -1739,7 +1811,7 @@
         <w:pStyle w:val="BodyText"/>
       </w:pPr>
       <w:r>
-        <w:t xml:space="preserve">Figure 1 presents the conceptual framework guiding the analysis. FOMC announcements generate two dimensions of monetary policy surprises — target shocks associated with unexpected current-rate decisions and path shocks associated with revisions to expected future policy paths. The paper examines whether these shocks predict FOMC statement sentiment and cross-asset financial-market responses.</w:t>
+        <w:t xml:space="preserve">Figure 1 presents the conceptual framework guiding the analysis. FOMC announcements generate two dimensions of monetary policy surprises — target shocks associated with unexpected current-rate decisions and path shocks associated with revisions to expected future policy paths. The paper examines whether these shocks predict FOMC statement sentiment and cross-asset financial-market responses. A further question, addressed in Section 6.9, is whether statement sentiment itself contains incremental information about asset returns beyond what the shocks capture, and whether this informational content varies across monetary policy regimes.</w:t>
       </w:r>
     </w:p>
     <w:p>
@@ -1765,7 +1837,7 @@
       <w:r>
         <w:drawing>
           <wp:inline>
-            <wp:extent cx="5029200" cy="2781417"/>
+            <wp:extent cx="5334000" cy="2632876"/>
             <wp:effectExtent b="0" l="0" r="0" t="0"/>
             <wp:docPr descr="" title="" id="21" name="Picture"/>
             <a:graphic>
@@ -1786,7 +1858,7 @@
                   <pic:spPr bwMode="auto">
                     <a:xfrm>
                       <a:off x="0" y="0"/>
-                      <a:ext cx="5029200" cy="2781417"/>
+                      <a:ext cx="5334000" cy="2632876"/>
                     </a:xfrm>
                     <a:prstGeom prst="rect">
                       <a:avLst/>
@@ -1814,7 +1886,7 @@
           <w:i/>
           <w:iCs/>
         </w:rPr>
-        <w:t xml:space="preserve">Figure 1: Conceptual Framework — Implementation vs. Revelation: How Do Monetary Policy Shocks Map to FOMC Language?</w:t>
+        <w:t xml:space="preserve">Figure 1: Conceptual Framework — Implementation vs. Revelation with Regime-Dependent Sentiment Channel</w:t>
       </w:r>
     </w:p>
     <w:p>
@@ -1826,7 +1898,42 @@
           <w:i/>
           <w:iCs/>
         </w:rPr>
-        <w:t xml:space="preserve">Note: Solid arrow = significant path (H1 favored); Dashed arrow = insignificant path (H2 not supported). Wald test p = 0.90 cannot reject equal effects.</w:t>
+        <w:t xml:space="preserve">Note: Solid blue arrows = significant paths (target shock predicts sentiment and returns); dashed red arrow = regime-dependent path (sentiment predicts returns in the FG period only); dotted orange arrow = moderator (policy regime conditions the sentiment–return relationship). Wald test</w:t>
+      </w:r>
+      <w:r>
+        <w:rPr>
+          <w:i/>
+          <w:iCs/>
+        </w:rPr>
+        <w:t xml:space="preserve"> </w:t>
+      </w:r>
+      <m:oMath>
+        <m:r>
+          <m:t>p</m:t>
+        </m:r>
+        <m:r>
+          <m:rPr>
+            <m:sty m:val="p"/>
+          </m:rPr>
+          <m:t>=</m:t>
+        </m:r>
+        <m:r>
+          <m:t>0.90</m:t>
+        </m:r>
+      </m:oMath>
+      <w:r>
+        <w:rPr>
+          <w:i/>
+          <w:iCs/>
+        </w:rPr>
+        <w:t xml:space="preserve"> </w:t>
+      </w:r>
+      <w:r>
+        <w:rPr>
+          <w:i/>
+          <w:iCs/>
+        </w:rPr>
+        <w:t xml:space="preserve">cannot reject equal target and path effects on sentiment.</w:t>
       </w:r>
     </w:p>
     <w:p>
@@ -6556,7 +6663,7 @@
         <w:pStyle w:val="BodyText"/>
       </w:pPr>
       <w:r>
-        <w:t xml:space="preserve">These results should be interpreted with caution. The B-S orthogonalization removes not only the predictable component but also potentially some of the genuine policy variation. Moreover, the choice of pre-FOMC controls is necessarily limited by data availability in our sample.</w:t>
+        <w:t xml:space="preserve">These results should be interpreted with caution. The B-S orthogonalization removes not only the predictable component but also potentially some of the genuine policy variation. Moreover, the choice of pre-FOMC controls is necessarily limited by data availability in our sample. The fact that the target shock loses significance for sentiment after orthogonalization while strengthening for returns suggests that the sentiment channel may be more sensitive to predictable components than the direct asset-return channel, but this asymmetry warrants further investigation with richer pre-FOMC control sets.</w:t>
       </w:r>
     </w:p>
     <w:p>
@@ -6578,7 +6685,15 @@
         <w:pStyle w:val="BodyText"/>
       </w:pPr>
       <w:r>
-        <w:t xml:space="preserve">The preceding analysis examines whether monetary policy shocks predict statement sentiment. A complementary question, central to the original research design, is whether statement sentiment itself contains incremental information about asset returns beyond what is captured by the target and path shocks. If FOMC language is merely a noisy reflection of the rate decision, then controlling for the two shock factors should eliminate any predictive power of sentiment. If, however, language conveys additional information, sentiment should retain explanatory power after controlling for shocks.</w:t>
+        <w:t xml:space="preserve">The preceding sections examine whether monetary policy shocks predict statement sentiment (H1) and asset returns (H2). This section reverses the causal lens: rather than asking whether shocks predict outcomes, we ask whether statement sentiment itself contains incremental information about asset returns beyond what the target and path shocks capture. This question is logically distinct from H1 and H2—it tests whether language serves as an independent information channel, not merely a byproduct of the rate decision.</w:t>
+      </w:r>
+    </w:p>
+    <w:p>
+      <w:pPr>
+        <w:pStyle w:val="BodyText"/>
+      </w:pPr>
+      <w:r>
+        <w:t xml:space="preserve">If FOMC language is merely a noisy reflection of the rate decision, then controlling for the two shock factors should eliminate any predictive power of sentiment. If, however, language conveys additional information—for example, about the Committee’s assessment of economic conditions, the balance of risks, or the likely trajectory of future policy—sentiment should retain explanatory power after controlling for shocks.</w:t>
       </w:r>
     </w:p>
     <w:p>

</xml_diff>

<commit_message>
fix: figures inline with captions — no more duplicates after References
</commit_message>
<xml_diff>
--- a/presentation_v10.3/Words_Beyond_the_Rate_v10.3_updated.docx
+++ b/presentation_v10.3/Words_Beyond_the_Rate_v10.3_updated.docx
@@ -6328,7 +6328,7 @@
           <wp:inline>
             <wp:extent cx="5334000" cy="1906281"/>
             <wp:effectExtent b="0" l="0" r="0" t="0"/>
-            <wp:docPr descr="Figure 4: JK Decomposition" title="" id="30" name="Picture"/>
+            <wp:docPr descr="Figure 4: Jarociński-Karadi Sign-Restriction Decomposition. Panel (a) shows the sentiment regression: neither the MP nor CBI component of the target shock is individually significant. Panel (b) shows the CRSP VW return regression: both components are highly significant with opposite signs (MP: \hat{\beta} = -1.029, p &lt; 0.001; CBI: \hat{\beta} = 0.844, p &lt; 0.001), confirming the information effect in asset markets but not in statement sentiment." title="" id="30" name="Picture"/>
             <a:graphic>
               <a:graphicData uri="http://schemas.openxmlformats.org/drawingml/2006/picture">
                 <pic:pic>
@@ -6371,7 +6371,107 @@
         <w:pStyle w:val="ImageCaption"/>
       </w:pPr>
       <w:r>
-        <w:t xml:space="preserve">Figure 4: JK Decomposition</w:t>
+        <w:t xml:space="preserve">Figure 4: Jarociński-Karadi Sign-Restriction Decomposition. Panel (a) shows the sentiment regression: neither the MP nor CBI component of the target shock is individually significant. Panel (b) shows the CRSP VW return regression: both components are highly significant with opposite signs (MP:</w:t>
+      </w:r>
+      <w:r>
+        <w:t xml:space="preserve"> </w:t>
+      </w:r>
+      <m:oMath>
+        <m:acc>
+          <m:accPr>
+            <m:chr m:val="̂"/>
+          </m:accPr>
+          <m:e>
+            <m:r>
+              <m:t>β</m:t>
+            </m:r>
+          </m:e>
+        </m:acc>
+        <m:r>
+          <m:rPr>
+            <m:sty m:val="p"/>
+          </m:rPr>
+          <m:t>=</m:t>
+        </m:r>
+        <m:r>
+          <m:rPr>
+            <m:sty m:val="p"/>
+          </m:rPr>
+          <m:t>−</m:t>
+        </m:r>
+        <m:r>
+          <m:t>1.029</m:t>
+        </m:r>
+      </m:oMath>
+      <w:r>
+        <w:t xml:space="preserve">,</w:t>
+      </w:r>
+      <w:r>
+        <w:t xml:space="preserve"> </w:t>
+      </w:r>
+      <m:oMath>
+        <m:r>
+          <m:t>p</m:t>
+        </m:r>
+        <m:r>
+          <m:rPr>
+            <m:sty m:val="p"/>
+          </m:rPr>
+          <m:t>&lt;</m:t>
+        </m:r>
+        <m:r>
+          <m:t>0.001</m:t>
+        </m:r>
+      </m:oMath>
+      <w:r>
+        <w:t xml:space="preserve">; CBI:</w:t>
+      </w:r>
+      <w:r>
+        <w:t xml:space="preserve"> </w:t>
+      </w:r>
+      <m:oMath>
+        <m:acc>
+          <m:accPr>
+            <m:chr m:val="̂"/>
+          </m:accPr>
+          <m:e>
+            <m:r>
+              <m:t>β</m:t>
+            </m:r>
+          </m:e>
+        </m:acc>
+        <m:r>
+          <m:rPr>
+            <m:sty m:val="p"/>
+          </m:rPr>
+          <m:t>=</m:t>
+        </m:r>
+        <m:r>
+          <m:t>0.844</m:t>
+        </m:r>
+      </m:oMath>
+      <w:r>
+        <w:t xml:space="preserve">,</w:t>
+      </w:r>
+      <w:r>
+        <w:t xml:space="preserve"> </w:t>
+      </w:r>
+      <m:oMath>
+        <m:r>
+          <m:t>p</m:t>
+        </m:r>
+        <m:r>
+          <m:rPr>
+            <m:sty m:val="p"/>
+          </m:rPr>
+          <m:t>&lt;</m:t>
+        </m:r>
+        <m:r>
+          <m:t>0.001</m:t>
+        </m:r>
+      </m:oMath>
+      <w:r>
+        <w:t xml:space="preserve">), confirming the information effect in asset markets but not in statement sentiment.</w:t>
       </w:r>
     </w:p>
     <w:p>
@@ -6612,7 +6712,7 @@
           <wp:inline>
             <wp:extent cx="5334000" cy="1906281"/>
             <wp:effectExtent b="0" l="0" r="0" t="0"/>
-            <wp:docPr descr="Figure 5: B-S Orthogonalization" title="" id="33" name="Picture"/>
+            <wp:docPr descr="Figure 5: Bauer-Swanson Orthogonalization. Panel (a) shows the sentiment regression: the target shock loses significance after orthogonalization (p = 0.012 \to 0.108). Panel (b) shows the CRSP VW return regression: the target shock strengthens (p = 0.043 \to 0.005), suggesting the predictable component attenuates the sentiment relationship but not the asset-return relationship." title="" id="33" name="Picture"/>
             <a:graphic>
               <a:graphicData uri="http://schemas.openxmlformats.org/drawingml/2006/picture">
                 <pic:pic>
@@ -6655,7 +6755,59 @@
         <w:pStyle w:val="ImageCaption"/>
       </w:pPr>
       <w:r>
-        <w:t xml:space="preserve">Figure 5: B-S Orthogonalization</w:t>
+        <w:t xml:space="preserve">Figure 5: Bauer-Swanson Orthogonalization. Panel (a) shows the sentiment regression: the target shock loses significance after orthogonalization (</w:t>
+      </w:r>
+      <m:oMath>
+        <m:r>
+          <m:t>p</m:t>
+        </m:r>
+        <m:r>
+          <m:rPr>
+            <m:sty m:val="p"/>
+          </m:rPr>
+          <m:t>=</m:t>
+        </m:r>
+        <m:r>
+          <m:t>0.012</m:t>
+        </m:r>
+        <m:r>
+          <m:rPr>
+            <m:sty m:val="p"/>
+          </m:rPr>
+          <m:t>→</m:t>
+        </m:r>
+        <m:r>
+          <m:t>0.108</m:t>
+        </m:r>
+      </m:oMath>
+      <w:r>
+        <w:t xml:space="preserve">). Panel (b) shows the CRSP VW return regression: the target shock strengthens (</w:t>
+      </w:r>
+      <m:oMath>
+        <m:r>
+          <m:t>p</m:t>
+        </m:r>
+        <m:r>
+          <m:rPr>
+            <m:sty m:val="p"/>
+          </m:rPr>
+          <m:t>=</m:t>
+        </m:r>
+        <m:r>
+          <m:t>0.043</m:t>
+        </m:r>
+        <m:r>
+          <m:rPr>
+            <m:sty m:val="p"/>
+          </m:rPr>
+          <m:t>→</m:t>
+        </m:r>
+        <m:r>
+          <m:t>0.005</m:t>
+        </m:r>
+      </m:oMath>
+      <w:r>
+        <w:t xml:space="preserve">), suggesting the predictable component attenuates the sentiment relationship but not the asset-return relationship.</w:t>
       </w:r>
     </w:p>
     <w:p>
@@ -7761,7 +7913,7 @@
           <wp:inline>
             <wp:extent cx="5334000" cy="1683747"/>
             <wp:effectExtent b="0" l="0" r="0" t="0"/>
-            <wp:docPr descr="Figure 6: Sentiment Incremental Power" title="" id="36" name="Picture"/>
+            <wp:docPr descr="Figure 6: Sentiment Incremental Explanatory Power. Panel (a) shows the full-sample incremental R^2 from adding sentiment to the shock-only model: marginal significance for S&amp;P 500 (p = 0.088) and 10-year Treasury (p = 0.098). Panel (b) shows the regime-dependent effect: R^2 = 30.6\% in the FG period versus 5.6\% in the non-FG period for CRSP VW returns. Panel (c) shows the scatter plot of sentiment versus CRSP VW returns, with FG-period observations (blue) exhibiting a strong negative relationship and non-FG observations (gray) showing no relationship." title="" id="36" name="Picture"/>
             <a:graphic>
               <a:graphicData uri="http://schemas.openxmlformats.org/drawingml/2006/picture">
                 <pic:pic>
@@ -7804,494 +7956,9 @@
         <w:pStyle w:val="ImageCaption"/>
       </w:pPr>
       <w:r>
-        <w:t xml:space="preserve">Figure 6: Sentiment Incremental Power</w:t>
-      </w:r>
-    </w:p>
-    <w:p>
-      <w:pPr>
-        <w:pStyle w:val="BodyText"/>
-      </w:pPr>
-      <w:r>
-        <w:rPr>
-          <w:b/>
-          <w:bCs/>
-        </w:rPr>
-        <w:t xml:space="preserve">7. Conclusion and Discussion</w:t>
-      </w:r>
-    </w:p>
-    <w:p>
-      <w:pPr>
-        <w:pStyle w:val="BodyText"/>
-      </w:pPr>
-      <w:r>
-        <w:t xml:space="preserve">Does FOMC statement language primarily reflect current policy implementation or forward-looking informational revelation? This paper addresses this question by combining high-frequency monetary policy shocks, textual sentiment analysis, and cross-asset financial-market responses within a unified empirical framework.</w:t>
-      </w:r>
-    </w:p>
-    <w:p>
-      <w:pPr>
-        <w:pStyle w:val="BodyText"/>
-      </w:pPr>
-      <w:r>
-        <w:t xml:space="preserve">Using the Gürkaynak-Sack-Swanson target-path decomposition across 117 FOMC meetings from 2006–2022, the paper finds that target shocks are more consistently associated with FOMC statement sentiment and equity-market responses than path shocks. The target shock significantly predicts statement sentiment, while the path shock remains comparatively weak and sensitive to specification.</w:t>
-      </w:r>
-    </w:p>
-    <w:p>
-      <w:pPr>
-        <w:pStyle w:val="BodyText"/>
-      </w:pPr>
-      <w:r>
-        <w:t xml:space="preserve">Cross-asset results provide additional evidence consistent with heterogeneous monetary-policy transmission. Equity-market responses are strongest among equal-weighted indices, suggesting that smaller firms are more sensitive to unexpected monetary-policy changes through financing-condition and balance-sheet channels. Treasury-yield and forward-guidance-related effects are comparatively limited in daily-frequency specifications.</w:t>
-      </w:r>
-    </w:p>
-    <w:p>
-      <w:pPr>
-        <w:pStyle w:val="BodyText"/>
-      </w:pPr>
-      <w:r>
-        <w:t xml:space="preserve">Taken together, the results suggest that FOMC statement sentiment appears more closely tied to current policy implementation and financing conditions than to strong forward-looking informational revelation in normal times. However, a key new finding concerns the regime-dependent informational content of FOMC language. While sentiment has limited incremental explanatory power for asset returns in the full sample, it becomes a highly significant predictor during the forward guidance period (</w:t>
-      </w:r>
-      <m:oMath>
-        <m:sSup>
-          <m:e>
-            <m:r>
-              <m:t>R</m:t>
-            </m:r>
-          </m:e>
-          <m:sup>
-            <m:r>
-              <m:t>2</m:t>
-            </m:r>
-          </m:sup>
-        </m:sSup>
-        <m:r>
-          <m:rPr>
-            <m:sty m:val="p"/>
-          </m:rPr>
-          <m:t>=</m:t>
-        </m:r>
-        <m:r>
-          <m:t>30.6</m:t>
-        </m:r>
-        <m:r>
-          <m:rPr>
-            <m:sty m:val="p"/>
-          </m:rPr>
-          <m:t>%</m:t>
-        </m:r>
-      </m:oMath>
-      <w:r>
-        <w:t xml:space="preserve"> </w:t>
-      </w:r>
-      <w:r>
-        <w:t xml:space="preserve">for CRSP VW returns,</w:t>
-      </w:r>
-      <w:r>
-        <w:t xml:space="preserve"> </w:t>
-      </w:r>
-      <m:oMath>
-        <m:r>
-          <m:t>p</m:t>
-        </m:r>
-        <m:r>
-          <m:rPr>
-            <m:sty m:val="p"/>
-          </m:rPr>
-          <m:t>=</m:t>
-        </m:r>
-        <m:r>
-          <m:t>0.004</m:t>
-        </m:r>
-      </m:oMath>
-      <w:r>
-        <w:t xml:space="preserve">), with a partial correlation of</w:t>
-      </w:r>
-      <w:r>
-        <w:t xml:space="preserve"> </w:t>
-      </w:r>
-      <m:oMath>
-        <m:r>
-          <m:rPr>
-            <m:sty m:val="p"/>
-          </m:rPr>
-          <m:t>−</m:t>
-        </m:r>
-        <m:r>
-          <m:t>0.364</m:t>
-        </m:r>
-      </m:oMath>
-      <w:r>
-        <w:t xml:space="preserve"> </w:t>
-      </w:r>
-      <w:r>
-        <w:t xml:space="preserve">conditional on target and path shocks. This regime dependence—robust to permutation tests, leave-one-out analysis, and multicollinearity checks—suggests that when the conventional interest-rate tool is constrained at the zero lower bound, FOMC statement language becomes the primary transmission channel for monetary policy. The full-sample weakness of the sentiment channel reflects the averaging of two very different regimes: one in which language is largely redundant with the rate decision, and one in which language is the primary policy signal.</w:t>
-      </w:r>
-    </w:p>
-    <w:p>
-      <w:pPr>
-        <w:pStyle w:val="BodyText"/>
-      </w:pPr>
-      <w:r>
-        <w:t xml:space="preserve">This finding receives independent support from Fernández-Fuertes (2025), who projects his LLM-constructed narrative surprises onto the GSS target/path factors and finds a significant target loading but a near-zero path loading—the same target-dominant pattern documented here. While Fernández-Fuertes constructs a superior shock measure using multi-agent LLMs, the present paper addresses a different question: not whether better shocks can be built, but what FOMC language itself conveys. Three contributions distinguish our analysis. First, we provide a systematic test of the implementation-versus-revelation distinction through four structured hypotheses, including a Wald test of coefficient equality and a forward-guidance interaction test that Fernández-Fuertes does not conduct. Second, we show that the target-path asymmetry differs across communication channels: path shocks become significant in Minutes (</w:t>
-      </w:r>
-      <m:oMath>
-        <m:r>
-          <m:t>p</m:t>
-        </m:r>
-        <m:r>
-          <m:rPr>
-            <m:sty m:val="p"/>
-          </m:rPr>
-          <m:t>=</m:t>
-        </m:r>
-        <m:r>
-          <m:t>0.015</m:t>
-        </m:r>
-      </m:oMath>
-      <w:r>
-        <w:t xml:space="preserve">) but not in Statements, suggesting that different Fed communication outlets serve different informational roles. Third, our dictionary-based approach, while less powerful than LLM methods, offers full transparency and reproducibility without API dependencies—any researcher with the data can replicate our results.</w:t>
-      </w:r>
-    </w:p>
-    <w:p>
-      <w:pPr>
-        <w:pStyle w:val="BodyText"/>
-      </w:pPr>
-      <w:r>
-        <w:t xml:space="preserve">Importantly, however, the results should not be interpreted as rejecting the information channel more broadly. Federal Reserve communication extends beyond the post-meeting statement itself and includes press conferences, Summary of Economic Projections releases, speeches, and broader expectation-management strategies. Moreover, the GSS path factor is not a pure information shock in the Jarociński-Karadi (2020) sense, but rather a broader measure of revisions to expected future policy paths.</w:t>
-      </w:r>
-    </w:p>
-    <w:p>
-      <w:pPr>
-        <w:pStyle w:val="BodyText"/>
-      </w:pPr>
-      <w:r>
-        <w:t xml:space="preserve">The paper also highlights several methodological considerations for future research. First, the choice of monetary policy surprise measure has first-order implications for inference. Properly identified high-frequency surprises substantially outperform simple realized rate changes in explaining communication outcomes. Second, domain-specific sentiment measures provide more informative results than general-purpose financial dictionaries when analyzing central-bank communication.</w:t>
-      </w:r>
-    </w:p>
-    <w:p>
-      <w:pPr>
-        <w:pStyle w:val="BodyText"/>
-      </w:pPr>
-      <w:r>
-        <w:t xml:space="preserve">Several limitations should be acknowledged. The sentiment measures remain relatively simple dictionary-based representations of institutional communication and may not fully capture contextual or semantic nuances embedded in FOMC language. In addition, daily-frequency financial-market data may dilute some high-frequency announcement effects, particularly for Treasury yields and forward-guidance-related responses.</w:t>
-      </w:r>
-    </w:p>
-    <w:p>
-      <w:pPr>
-        <w:pStyle w:val="BodyText"/>
-      </w:pPr>
-      <w:r>
-        <w:t xml:space="preserve">Future research may therefore benefit from:</w:t>
-      </w:r>
-    </w:p>
-    <w:p>
-      <w:pPr>
-        <w:numPr>
-          <w:ilvl w:val="0"/>
-          <w:numId w:val="1010"/>
-        </w:numPr>
-      </w:pPr>
-      <w:r>
-        <w:t xml:space="preserve">more advanced language models,</w:t>
-      </w:r>
-    </w:p>
-    <w:p>
-      <w:pPr>
-        <w:numPr>
-          <w:ilvl w:val="0"/>
-          <w:numId w:val="1010"/>
-        </w:numPr>
-      </w:pPr>
-      <w:r>
-        <w:t xml:space="preserve">higher-frequency market data,</w:t>
-      </w:r>
-    </w:p>
-    <w:p>
-      <w:pPr>
-        <w:numPr>
-          <w:ilvl w:val="0"/>
-          <w:numId w:val="1010"/>
-        </w:numPr>
-      </w:pPr>
-      <w:r>
-        <w:t xml:space="preserve">broader communication corpora,</w:t>
-      </w:r>
-    </w:p>
-    <w:p>
-      <w:pPr>
-        <w:numPr>
-          <w:ilvl w:val="0"/>
-          <w:numId w:val="1010"/>
-        </w:numPr>
-      </w:pPr>
-      <w:r>
-        <w:t xml:space="preserve">and structural identification approaches that separately distinguish monetary policy shocks from information shocks.</w:t>
-      </w:r>
-    </w:p>
-    <w:p>
-      <w:pPr>
-        <w:pStyle w:val="FirstParagraph"/>
-      </w:pPr>
-      <w:r>
-        <w:t xml:space="preserve">More broadly, the paper demonstrates the value of integrating textual analysis with high-frequency monetary policy identification. As central banks increasingly rely on communication and expectation management as policy instruments, understanding the relationship between monetary policy shocks and central-bank language remains an important area for both macroeconomic research and policy analysis.</w:t>
-      </w:r>
-    </w:p>
-    <w:p>
-      <w:pPr>
-        <w:pStyle w:val="BodyText"/>
-      </w:pPr>
-      <w:r>
-        <w:rPr>
-          <w:b/>
-          <w:bCs/>
-        </w:rPr>
-        <w:t xml:space="preserve">Data Availability.</w:t>
-      </w:r>
-      <w:r>
-        <w:t xml:space="preserve"> </w:t>
-      </w:r>
-      <w:r>
-        <w:t xml:space="preserve">The monetary policy shock data from Acosta (2022) are publicly available. FOMC statements are available from the Federal Reserve website. CRSP market data are available through WRDS with an institutional subscription. The replication code and processed datasets will be made available upon publication.</w:t>
-      </w:r>
-    </w:p>
-    <w:p>
-      <w:r>
-        <w:pict>
-          <v:rect style="width:0;height:1.5pt" o:hralign="center" o:hrstd="t" o:hr="t"/>
-        </w:pict>
-      </w:r>
-    </w:p>
-    <w:p>
-      <w:pPr>
-        <w:pStyle w:val="FirstParagraph"/>
-      </w:pPr>
-      <w:r>
-        <w:rPr>
-          <w:i/>
-          <w:iCs/>
-        </w:rPr>
-        <w:t xml:space="preserve">Figure 4: Jarociński-Karadi Sign-Restriction Decomposition. Panel (a) shows the sentiment regression: neither the MP nor CBI component of the target shock is individually significant. Panel (b) shows the CRSP VW return regression: both components are highly significant with opposite signs (MP:</w:t>
-      </w:r>
-      <w:r>
-        <w:rPr>
-          <w:i/>
-          <w:iCs/>
-        </w:rPr>
-        <w:t xml:space="preserve"> </w:t>
-      </w:r>
-      <m:oMath>
-        <m:acc>
-          <m:accPr>
-            <m:chr m:val="̂"/>
-          </m:accPr>
-          <m:e>
-            <m:r>
-              <m:t>β</m:t>
-            </m:r>
-          </m:e>
-        </m:acc>
-        <m:r>
-          <m:rPr>
-            <m:sty m:val="p"/>
-          </m:rPr>
-          <m:t>=</m:t>
-        </m:r>
-        <m:r>
-          <m:rPr>
-            <m:sty m:val="p"/>
-          </m:rPr>
-          <m:t>−</m:t>
-        </m:r>
-        <m:r>
-          <m:t>1.029</m:t>
-        </m:r>
-      </m:oMath>
-      <w:r>
-        <w:rPr>
-          <w:i/>
-          <w:iCs/>
-        </w:rPr>
-        <w:t xml:space="preserve">,</w:t>
-      </w:r>
-      <w:r>
-        <w:rPr>
-          <w:i/>
-          <w:iCs/>
-        </w:rPr>
-        <w:t xml:space="preserve"> </w:t>
-      </w:r>
-      <m:oMath>
-        <m:r>
-          <m:t>p</m:t>
-        </m:r>
-        <m:r>
-          <m:rPr>
-            <m:sty m:val="p"/>
-          </m:rPr>
-          <m:t>&lt;</m:t>
-        </m:r>
-        <m:r>
-          <m:t>0.001</m:t>
-        </m:r>
-      </m:oMath>
-      <w:r>
-        <w:rPr>
-          <w:i/>
-          <w:iCs/>
-        </w:rPr>
-        <w:t xml:space="preserve">; CBI:</w:t>
-      </w:r>
-      <w:r>
-        <w:rPr>
-          <w:i/>
-          <w:iCs/>
-        </w:rPr>
-        <w:t xml:space="preserve"> </w:t>
-      </w:r>
-      <m:oMath>
-        <m:acc>
-          <m:accPr>
-            <m:chr m:val="̂"/>
-          </m:accPr>
-          <m:e>
-            <m:r>
-              <m:t>β</m:t>
-            </m:r>
-          </m:e>
-        </m:acc>
-        <m:r>
-          <m:rPr>
-            <m:sty m:val="p"/>
-          </m:rPr>
-          <m:t>=</m:t>
-        </m:r>
-        <m:r>
-          <m:t>0.844</m:t>
-        </m:r>
-      </m:oMath>
-      <w:r>
-        <w:rPr>
-          <w:i/>
-          <w:iCs/>
-        </w:rPr>
-        <w:t xml:space="preserve">,</w:t>
-      </w:r>
-      <w:r>
-        <w:rPr>
-          <w:i/>
-          <w:iCs/>
-        </w:rPr>
-        <w:t xml:space="preserve"> </w:t>
-      </w:r>
-      <m:oMath>
-        <m:r>
-          <m:t>p</m:t>
-        </m:r>
-        <m:r>
-          <m:rPr>
-            <m:sty m:val="p"/>
-          </m:rPr>
-          <m:t>&lt;</m:t>
-        </m:r>
-        <m:r>
-          <m:t>0.001</m:t>
-        </m:r>
-      </m:oMath>
-      <w:r>
-        <w:rPr>
-          <w:i/>
-          <w:iCs/>
-        </w:rPr>
-        <w:t xml:space="preserve">), confirming the information effect in asset markets but not in statement sentiment.</w:t>
-      </w:r>
-    </w:p>
-    <w:p>
-      <w:pPr>
-        <w:pStyle w:val="BodyText"/>
-      </w:pPr>
-      <w:r>
-        <w:rPr>
-          <w:i/>
-          <w:iCs/>
-        </w:rPr>
-        <w:t xml:space="preserve">Figure 5: Bauer-Swanson Orthogonalization. Panel (a) shows the sentiment regression: the target shock loses significance after orthogonalization (</w:t>
-      </w:r>
-      <m:oMath>
-        <m:r>
-          <m:t>p</m:t>
-        </m:r>
-        <m:r>
-          <m:rPr>
-            <m:sty m:val="p"/>
-          </m:rPr>
-          <m:t>=</m:t>
-        </m:r>
-        <m:r>
-          <m:t>0.012</m:t>
-        </m:r>
-        <m:r>
-          <m:rPr>
-            <m:sty m:val="p"/>
-          </m:rPr>
-          <m:t>→</m:t>
-        </m:r>
-        <m:r>
-          <m:t>0.108</m:t>
-        </m:r>
-      </m:oMath>
-      <w:r>
-        <w:rPr>
-          <w:i/>
-          <w:iCs/>
-        </w:rPr>
-        <w:t xml:space="preserve">). Panel (b) shows the CRSP VW return regression: the target shock strengthens (</w:t>
-      </w:r>
-      <m:oMath>
-        <m:r>
-          <m:t>p</m:t>
-        </m:r>
-        <m:r>
-          <m:rPr>
-            <m:sty m:val="p"/>
-          </m:rPr>
-          <m:t>=</m:t>
-        </m:r>
-        <m:r>
-          <m:t>0.043</m:t>
-        </m:r>
-        <m:r>
-          <m:rPr>
-            <m:sty m:val="p"/>
-          </m:rPr>
-          <m:t>→</m:t>
-        </m:r>
-        <m:r>
-          <m:t>0.005</m:t>
-        </m:r>
-      </m:oMath>
-      <w:r>
-        <w:rPr>
-          <w:i/>
-          <w:iCs/>
-        </w:rPr>
-        <w:t xml:space="preserve">), suggesting the predictable component attenuates the sentiment relationship but not the asset-return relationship.</w:t>
-      </w:r>
-    </w:p>
-    <w:p>
-      <w:pPr>
-        <w:pStyle w:val="BodyText"/>
-      </w:pPr>
-      <w:r>
-        <w:rPr>
-          <w:i/>
-          <w:iCs/>
-        </w:rPr>
         <w:t xml:space="preserve">Figure 6: Sentiment Incremental Explanatory Power. Panel (a) shows the full-sample incremental</w:t>
       </w:r>
       <w:r>
-        <w:rPr>
-          <w:i/>
-          <w:iCs/>
-        </w:rPr>
         <w:t xml:space="preserve"> </w:t>
       </w:r>
       <m:oMath>
@@ -8309,17 +7976,9 @@
         </m:sSup>
       </m:oMath>
       <w:r>
-        <w:rPr>
-          <w:i/>
-          <w:iCs/>
-        </w:rPr>
         <w:t xml:space="preserve"> </w:t>
       </w:r>
       <w:r>
-        <w:rPr>
-          <w:i/>
-          <w:iCs/>
-        </w:rPr>
         <w:t xml:space="preserve">from adding sentiment to the shock-only model: marginal significance for S&amp;P 500 (</w:t>
       </w:r>
       <m:oMath>
@@ -8337,10 +7996,6 @@
         </m:r>
       </m:oMath>
       <w:r>
-        <w:rPr>
-          <w:i/>
-          <w:iCs/>
-        </w:rPr>
         <w:t xml:space="preserve">) and 10-year Treasury (</w:t>
       </w:r>
       <m:oMath>
@@ -8358,17 +8013,9 @@
         </m:r>
       </m:oMath>
       <w:r>
-        <w:rPr>
-          <w:i/>
-          <w:iCs/>
-        </w:rPr>
         <w:t xml:space="preserve">). Panel (b) shows the regime-dependent effect:</w:t>
       </w:r>
       <w:r>
-        <w:rPr>
-          <w:i/>
-          <w:iCs/>
-        </w:rPr>
         <w:t xml:space="preserve"> </w:t>
       </w:r>
       <m:oMath>
@@ -8401,24 +8048,12 @@
         </m:r>
       </m:oMath>
       <w:r>
-        <w:rPr>
-          <w:i/>
-          <w:iCs/>
-        </w:rPr>
         <w:t xml:space="preserve"> </w:t>
       </w:r>
       <w:r>
-        <w:rPr>
-          <w:i/>
-          <w:iCs/>
-        </w:rPr>
         <w:t xml:space="preserve">in the FG period versus</w:t>
       </w:r>
       <w:r>
-        <w:rPr>
-          <w:i/>
-          <w:iCs/>
-        </w:rPr>
         <w:t xml:space="preserve"> </w:t>
       </w:r>
       <m:oMath>
@@ -8433,30 +8068,261 @@
         </m:r>
       </m:oMath>
       <w:r>
-        <w:rPr>
-          <w:i/>
-          <w:iCs/>
-        </w:rPr>
         <w:t xml:space="preserve"> </w:t>
       </w:r>
       <w:r>
-        <w:rPr>
-          <w:i/>
-          <w:iCs/>
-        </w:rPr>
         <w:t xml:space="preserve">in the non-FG period for CRSP VW returns. Panel (c) shows the scatter plot of sentiment versus CRSP VW returns, with FG-period observations (blue) exhibiting a strong negative relationship and non-FG observations (gray) showing no relationship.</w:t>
       </w:r>
     </w:p>
     <w:p>
-      <w:r>
-        <w:pict>
-          <v:rect style="width:0;height:1.5pt" o:hralign="center" o:hrstd="t" o:hr="t"/>
-        </w:pict>
+      <w:pPr>
+        <w:pStyle w:val="BodyText"/>
+      </w:pPr>
+      <w:r>
+        <w:rPr>
+          <w:b/>
+          <w:bCs/>
+        </w:rPr>
+        <w:t xml:space="preserve">7. Conclusion and Discussion</w:t>
+      </w:r>
+    </w:p>
+    <w:p>
+      <w:pPr>
+        <w:pStyle w:val="BodyText"/>
+      </w:pPr>
+      <w:r>
+        <w:t xml:space="preserve">Does FOMC statement language primarily reflect current policy implementation or forward-looking informational revelation? This paper addresses this question by combining high-frequency monetary policy shocks, textual sentiment analysis, and cross-asset financial-market responses within a unified empirical framework.</w:t>
+      </w:r>
+    </w:p>
+    <w:p>
+      <w:pPr>
+        <w:pStyle w:val="BodyText"/>
+      </w:pPr>
+      <w:r>
+        <w:t xml:space="preserve">Using the Gürkaynak-Sack-Swanson target-path decomposition across 117 FOMC meetings from 2006–2022, the paper finds that target shocks are more consistently associated with FOMC statement sentiment and equity-market responses than path shocks. The target shock significantly predicts statement sentiment, while the path shock remains comparatively weak and sensitive to specification.</w:t>
+      </w:r>
+    </w:p>
+    <w:p>
+      <w:pPr>
+        <w:pStyle w:val="BodyText"/>
+      </w:pPr>
+      <w:r>
+        <w:t xml:space="preserve">Cross-asset results provide additional evidence consistent with heterogeneous monetary-policy transmission. Equity-market responses are strongest among equal-weighted indices, suggesting that smaller firms are more sensitive to unexpected monetary-policy changes through financing-condition and balance-sheet channels. Treasury-yield and forward-guidance-related effects are comparatively limited in daily-frequency specifications.</w:t>
+      </w:r>
+    </w:p>
+    <w:p>
+      <w:pPr>
+        <w:pStyle w:val="BodyText"/>
+      </w:pPr>
+      <w:r>
+        <w:t xml:space="preserve">Taken together, the results suggest that FOMC statement sentiment appears more closely tied to current policy implementation and financing conditions than to strong forward-looking informational revelation in normal times. However, a key new finding concerns the regime-dependent informational content of FOMC language. While sentiment has limited incremental explanatory power for asset returns in the full sample, it becomes a highly significant predictor during the forward guidance period (</w:t>
+      </w:r>
+      <m:oMath>
+        <m:sSup>
+          <m:e>
+            <m:r>
+              <m:t>R</m:t>
+            </m:r>
+          </m:e>
+          <m:sup>
+            <m:r>
+              <m:t>2</m:t>
+            </m:r>
+          </m:sup>
+        </m:sSup>
+        <m:r>
+          <m:rPr>
+            <m:sty m:val="p"/>
+          </m:rPr>
+          <m:t>=</m:t>
+        </m:r>
+        <m:r>
+          <m:t>30.6</m:t>
+        </m:r>
+        <m:r>
+          <m:rPr>
+            <m:sty m:val="p"/>
+          </m:rPr>
+          <m:t>%</m:t>
+        </m:r>
+      </m:oMath>
+      <w:r>
+        <w:t xml:space="preserve"> </w:t>
+      </w:r>
+      <w:r>
+        <w:t xml:space="preserve">for CRSP VW returns,</w:t>
+      </w:r>
+      <w:r>
+        <w:t xml:space="preserve"> </w:t>
+      </w:r>
+      <m:oMath>
+        <m:r>
+          <m:t>p</m:t>
+        </m:r>
+        <m:r>
+          <m:rPr>
+            <m:sty m:val="p"/>
+          </m:rPr>
+          <m:t>=</m:t>
+        </m:r>
+        <m:r>
+          <m:t>0.004</m:t>
+        </m:r>
+      </m:oMath>
+      <w:r>
+        <w:t xml:space="preserve">), with a partial correlation of</w:t>
+      </w:r>
+      <w:r>
+        <w:t xml:space="preserve"> </w:t>
+      </w:r>
+      <m:oMath>
+        <m:r>
+          <m:rPr>
+            <m:sty m:val="p"/>
+          </m:rPr>
+          <m:t>−</m:t>
+        </m:r>
+        <m:r>
+          <m:t>0.364</m:t>
+        </m:r>
+      </m:oMath>
+      <w:r>
+        <w:t xml:space="preserve"> </w:t>
+      </w:r>
+      <w:r>
+        <w:t xml:space="preserve">conditional on target and path shocks. This regime dependence—robust to permutation tests, leave-one-out analysis, and multicollinearity checks—suggests that when the conventional interest-rate tool is constrained at the zero lower bound, FOMC statement language becomes the primary transmission channel for monetary policy. The full-sample weakness of the sentiment channel reflects the averaging of two very different regimes: one in which language is largely redundant with the rate decision, and one in which language is the primary policy signal.</w:t>
+      </w:r>
+    </w:p>
+    <w:p>
+      <w:pPr>
+        <w:pStyle w:val="BodyText"/>
+      </w:pPr>
+      <w:r>
+        <w:t xml:space="preserve">This finding receives independent support from Fernández-Fuertes (2025), who projects his LLM-constructed narrative surprises onto the GSS target/path factors and finds a significant target loading but a near-zero path loading—the same target-dominant pattern documented here. While Fernández-Fuertes constructs a superior shock measure using multi-agent LLMs, the present paper addresses a different question: not whether better shocks can be built, but what FOMC language itself conveys. Three contributions distinguish our analysis. First, we provide a systematic test of the implementation-versus-revelation distinction through four structured hypotheses, including a Wald test of coefficient equality and a forward-guidance interaction test that Fernández-Fuertes does not conduct. Second, we show that the target-path asymmetry differs across communication channels: path shocks become significant in Minutes (</w:t>
+      </w:r>
+      <m:oMath>
+        <m:r>
+          <m:t>p</m:t>
+        </m:r>
+        <m:r>
+          <m:rPr>
+            <m:sty m:val="p"/>
+          </m:rPr>
+          <m:t>=</m:t>
+        </m:r>
+        <m:r>
+          <m:t>0.015</m:t>
+        </m:r>
+      </m:oMath>
+      <w:r>
+        <w:t xml:space="preserve">) but not in Statements, suggesting that different Fed communication outlets serve different informational roles. Third, our dictionary-based approach, while less powerful than LLM methods, offers full transparency and reproducibility without API dependencies—any researcher with the data can replicate our results.</w:t>
+      </w:r>
+    </w:p>
+    <w:p>
+      <w:pPr>
+        <w:pStyle w:val="BodyText"/>
+      </w:pPr>
+      <w:r>
+        <w:t xml:space="preserve">Importantly, however, the results should not be interpreted as rejecting the information channel more broadly. Federal Reserve communication extends beyond the post-meeting statement itself and includes press conferences, Summary of Economic Projections releases, speeches, and broader expectation-management strategies. Moreover, the GSS path factor is not a pure information shock in the Jarociński-Karadi (2020) sense, but rather a broader measure of revisions to expected future policy paths.</w:t>
+      </w:r>
+    </w:p>
+    <w:p>
+      <w:pPr>
+        <w:pStyle w:val="BodyText"/>
+      </w:pPr>
+      <w:r>
+        <w:t xml:space="preserve">The paper also highlights several methodological considerations for future research. First, the choice of monetary policy surprise measure has first-order implications for inference. Properly identified high-frequency surprises substantially outperform simple realized rate changes in explaining communication outcomes. Second, domain-specific sentiment measures provide more informative results than general-purpose financial dictionaries when analyzing central-bank communication.</w:t>
+      </w:r>
+    </w:p>
+    <w:p>
+      <w:pPr>
+        <w:pStyle w:val="BodyText"/>
+      </w:pPr>
+      <w:r>
+        <w:t xml:space="preserve">Several limitations should be acknowledged. The sentiment measures remain relatively simple dictionary-based representations of institutional communication and may not fully capture contextual or semantic nuances embedded in FOMC language. In addition, daily-frequency financial-market data may dilute some high-frequency announcement effects, particularly for Treasury yields and forward-guidance-related responses.</w:t>
+      </w:r>
+    </w:p>
+    <w:p>
+      <w:pPr>
+        <w:pStyle w:val="BodyText"/>
+      </w:pPr>
+      <w:r>
+        <w:t xml:space="preserve">Future research may therefore benefit from:</w:t>
+      </w:r>
+    </w:p>
+    <w:p>
+      <w:pPr>
+        <w:numPr>
+          <w:ilvl w:val="0"/>
+          <w:numId w:val="1010"/>
+        </w:numPr>
+      </w:pPr>
+      <w:r>
+        <w:t xml:space="preserve">more advanced language models,</w:t>
+      </w:r>
+    </w:p>
+    <w:p>
+      <w:pPr>
+        <w:numPr>
+          <w:ilvl w:val="0"/>
+          <w:numId w:val="1010"/>
+        </w:numPr>
+      </w:pPr>
+      <w:r>
+        <w:t xml:space="preserve">higher-frequency market data,</w:t>
+      </w:r>
+    </w:p>
+    <w:p>
+      <w:pPr>
+        <w:numPr>
+          <w:ilvl w:val="0"/>
+          <w:numId w:val="1010"/>
+        </w:numPr>
+      </w:pPr>
+      <w:r>
+        <w:t xml:space="preserve">broader communication corpora,</w:t>
+      </w:r>
+    </w:p>
+    <w:p>
+      <w:pPr>
+        <w:numPr>
+          <w:ilvl w:val="0"/>
+          <w:numId w:val="1010"/>
+        </w:numPr>
+      </w:pPr>
+      <w:r>
+        <w:t xml:space="preserve">and structural identification approaches that separately distinguish monetary policy shocks from information shocks.</w:t>
       </w:r>
     </w:p>
     <w:p>
       <w:pPr>
         <w:pStyle w:val="FirstParagraph"/>
+      </w:pPr>
+      <w:r>
+        <w:t xml:space="preserve">More broadly, the paper demonstrates the value of integrating textual analysis with high-frequency monetary policy identification. As central banks increasingly rely on communication and expectation management as policy instruments, understanding the relationship between monetary policy shocks and central-bank language remains an important area for both macroeconomic research and policy analysis.</w:t>
+      </w:r>
+    </w:p>
+    <w:p>
+      <w:pPr>
+        <w:pStyle w:val="BodyText"/>
+      </w:pPr>
+      <w:r>
+        <w:rPr>
+          <w:b/>
+          <w:bCs/>
+        </w:rPr>
+        <w:t xml:space="preserve">Data Availability.</w:t>
+      </w:r>
+      <w:r>
+        <w:t xml:space="preserve"> </w:t>
+      </w:r>
+      <w:r>
+        <w:t xml:space="preserve">The monetary policy shock data from Acosta (2022) are publicly available. FOMC statements are available from the Federal Reserve website. CRSP market data are available through WRDS with an institutional subscription. The replication code and processed datasets will be made available upon publication.</w:t>
+      </w:r>
+    </w:p>
+    <w:p>
+      <w:pPr>
+        <w:pStyle w:val="BodyText"/>
       </w:pPr>
       <w:r>
         <w:rPr>

</xml_diff>

<commit_message>
fix: figures 4-6 placed after text reference + before next section, caveat moved before figure
</commit_message>
<xml_diff>
--- a/presentation_v10.3/Words_Beyond_the_Rate_v10.3_updated.docx
+++ b/presentation_v10.3/Words_Beyond_the_Rate_v10.3_updated.docx
@@ -6316,7 +6316,7 @@
         <w:t xml:space="preserve"> </w:t>
       </w:r>
       <w:r>
-        <w:t xml:space="preserve">increases from 9.1% in the baseline to 35.7%. This confirms that the information effect is present in asset markets—CBI shocks generate positive equity responses consistent with the central bank revealing favorable information—but statement sentiment does not differentiate between MP and CBI components.</w:t>
+        <w:t xml:space="preserve">increases from 9.1% in the baseline to 35.7%. This confirms that the information effect is present in asset markets—CBI shocks generate positive equity responses consistent with the central bank revealing favorable information—but statement sentiment does not differentiate between MP and CBI components. Figure 4 summarizes these results.</w:t>
       </w:r>
     </w:p>
     <w:p>
@@ -6328,7 +6328,7 @@
           <wp:inline>
             <wp:extent cx="5334000" cy="1906281"/>
             <wp:effectExtent b="0" l="0" r="0" t="0"/>
-            <wp:docPr descr="Figure 4: Jarociński-Karadi Sign-Restriction Decomposition. Panel (a) shows the sentiment regression: neither the MP nor CBI component of the target shock is individually significant. Panel (b) shows the CRSP VW return regression: both components are highly significant with opposite signs (MP: \hat{\beta} = -1.029, p &lt; 0.001; CBI: \hat{\beta} = 0.844, p &lt; 0.001), confirming the information effect in asset markets but not in statement sentiment." title="" id="30" name="Picture"/>
+            <wp:docPr descr="Figure 4: Jarociński-Karadi Sign-Restriction Decomposition. Panel (a): sentiment regression — neither the MP nor CBI component is individually significant. Panel (b): CRSP VW return regression — both components are highly significant with opposite signs, confirming the information effect in asset markets but not in statement sentiment." title="" id="30" name="Picture"/>
             <a:graphic>
               <a:graphicData uri="http://schemas.openxmlformats.org/drawingml/2006/picture">
                 <pic:pic>
@@ -6371,107 +6371,7 @@
         <w:pStyle w:val="ImageCaption"/>
       </w:pPr>
       <w:r>
-        <w:t xml:space="preserve">Figure 4: Jarociński-Karadi Sign-Restriction Decomposition. Panel (a) shows the sentiment regression: neither the MP nor CBI component of the target shock is individually significant. Panel (b) shows the CRSP VW return regression: both components are highly significant with opposite signs (MP:</w:t>
-      </w:r>
-      <w:r>
-        <w:t xml:space="preserve"> </w:t>
-      </w:r>
-      <m:oMath>
-        <m:acc>
-          <m:accPr>
-            <m:chr m:val="̂"/>
-          </m:accPr>
-          <m:e>
-            <m:r>
-              <m:t>β</m:t>
-            </m:r>
-          </m:e>
-        </m:acc>
-        <m:r>
-          <m:rPr>
-            <m:sty m:val="p"/>
-          </m:rPr>
-          <m:t>=</m:t>
-        </m:r>
-        <m:r>
-          <m:rPr>
-            <m:sty m:val="p"/>
-          </m:rPr>
-          <m:t>−</m:t>
-        </m:r>
-        <m:r>
-          <m:t>1.029</m:t>
-        </m:r>
-      </m:oMath>
-      <w:r>
-        <w:t xml:space="preserve">,</w:t>
-      </w:r>
-      <w:r>
-        <w:t xml:space="preserve"> </w:t>
-      </w:r>
-      <m:oMath>
-        <m:r>
-          <m:t>p</m:t>
-        </m:r>
-        <m:r>
-          <m:rPr>
-            <m:sty m:val="p"/>
-          </m:rPr>
-          <m:t>&lt;</m:t>
-        </m:r>
-        <m:r>
-          <m:t>0.001</m:t>
-        </m:r>
-      </m:oMath>
-      <w:r>
-        <w:t xml:space="preserve">; CBI:</w:t>
-      </w:r>
-      <w:r>
-        <w:t xml:space="preserve"> </w:t>
-      </w:r>
-      <m:oMath>
-        <m:acc>
-          <m:accPr>
-            <m:chr m:val="̂"/>
-          </m:accPr>
-          <m:e>
-            <m:r>
-              <m:t>β</m:t>
-            </m:r>
-          </m:e>
-        </m:acc>
-        <m:r>
-          <m:rPr>
-            <m:sty m:val="p"/>
-          </m:rPr>
-          <m:t>=</m:t>
-        </m:r>
-        <m:r>
-          <m:t>0.844</m:t>
-        </m:r>
-      </m:oMath>
-      <w:r>
-        <w:t xml:space="preserve">,</w:t>
-      </w:r>
-      <w:r>
-        <w:t xml:space="preserve"> </w:t>
-      </w:r>
-      <m:oMath>
-        <m:r>
-          <m:t>p</m:t>
-        </m:r>
-        <m:r>
-          <m:rPr>
-            <m:sty m:val="p"/>
-          </m:rPr>
-          <m:t>&lt;</m:t>
-        </m:r>
-        <m:r>
-          <m:t>0.001</m:t>
-        </m:r>
-      </m:oMath>
-      <w:r>
-        <w:t xml:space="preserve">), confirming the information effect in asset markets but not in statement sentiment.</w:t>
+        <w:t xml:space="preserve">Figure 4: Jarociński-Karadi Sign-Restriction Decomposition. Panel (a): sentiment regression — neither the MP nor CBI component is individually significant. Panel (b): CRSP VW return regression — both components are highly significant with opposite signs, confirming the information effect in asset markets but not in statement sentiment.</w:t>
       </w:r>
     </w:p>
     <w:p>
@@ -6700,7 +6600,7 @@
         </m:r>
       </m:oMath>
       <w:r>
-        <w:t xml:space="preserve">). This asymmetry suggests that the predictable component of the target shock may be attenuating the sentiment relationship but is irrelevant for the asset-return relationship, consistent with the interpretation that sentiment captures a broader communication channel while asset returns respond more directly to the pure policy surprise.</w:t>
+        <w:t xml:space="preserve">). This asymmetry suggests that the predictable component of the target shock may be attenuating the sentiment relationship but is irrelevant for the asset-return relationship, consistent with the interpretation that sentiment captures a broader communication channel while asset returns respond more directly to the pure policy surprise. These results should be interpreted with caution. The B-S orthogonalization removes not only the predictable component but also potentially some of the genuine policy variation. Moreover, the choice of pre-FOMC controls is necessarily limited by data availability in our sample. The fact that the target shock loses significance for sentiment after orthogonalization while strengthening for returns suggests that the sentiment channel may be more sensitive to predictable components than the direct asset-return channel, but this asymmetry warrants further investigation with richer pre-FOMC control sets. Figure 5 summarizes these results.</w:t>
       </w:r>
     </w:p>
     <w:p>
@@ -6712,7 +6612,7 @@
           <wp:inline>
             <wp:extent cx="5334000" cy="1906281"/>
             <wp:effectExtent b="0" l="0" r="0" t="0"/>
-            <wp:docPr descr="Figure 5: Bauer-Swanson Orthogonalization. Panel (a) shows the sentiment regression: the target shock loses significance after orthogonalization (p = 0.012 \to 0.108). Panel (b) shows the CRSP VW return regression: the target shock strengthens (p = 0.043 \to 0.005), suggesting the predictable component attenuates the sentiment relationship but not the asset-return relationship." title="" id="33" name="Picture"/>
+            <wp:docPr descr="Figure 5: Bauer-Swanson Orthogonalization. Panel (a): sentiment regression — the target shock loses significance after orthogonalization. Panel (b): CRSP VW return regression — the target shock strengthens, suggesting the predictable component attenuates the sentiment relationship but not the asset-return relationship." title="" id="33" name="Picture"/>
             <a:graphic>
               <a:graphicData uri="http://schemas.openxmlformats.org/drawingml/2006/picture">
                 <pic:pic>
@@ -6755,67 +6655,7 @@
         <w:pStyle w:val="ImageCaption"/>
       </w:pPr>
       <w:r>
-        <w:t xml:space="preserve">Figure 5: Bauer-Swanson Orthogonalization. Panel (a) shows the sentiment regression: the target shock loses significance after orthogonalization (</w:t>
-      </w:r>
-      <m:oMath>
-        <m:r>
-          <m:t>p</m:t>
-        </m:r>
-        <m:r>
-          <m:rPr>
-            <m:sty m:val="p"/>
-          </m:rPr>
-          <m:t>=</m:t>
-        </m:r>
-        <m:r>
-          <m:t>0.012</m:t>
-        </m:r>
-        <m:r>
-          <m:rPr>
-            <m:sty m:val="p"/>
-          </m:rPr>
-          <m:t>→</m:t>
-        </m:r>
-        <m:r>
-          <m:t>0.108</m:t>
-        </m:r>
-      </m:oMath>
-      <w:r>
-        <w:t xml:space="preserve">). Panel (b) shows the CRSP VW return regression: the target shock strengthens (</w:t>
-      </w:r>
-      <m:oMath>
-        <m:r>
-          <m:t>p</m:t>
-        </m:r>
-        <m:r>
-          <m:rPr>
-            <m:sty m:val="p"/>
-          </m:rPr>
-          <m:t>=</m:t>
-        </m:r>
-        <m:r>
-          <m:t>0.043</m:t>
-        </m:r>
-        <m:r>
-          <m:rPr>
-            <m:sty m:val="p"/>
-          </m:rPr>
-          <m:t>→</m:t>
-        </m:r>
-        <m:r>
-          <m:t>0.005</m:t>
-        </m:r>
-      </m:oMath>
-      <w:r>
-        <w:t xml:space="preserve">), suggesting the predictable component attenuates the sentiment relationship but not the asset-return relationship.</w:t>
-      </w:r>
-    </w:p>
-    <w:p>
-      <w:pPr>
-        <w:pStyle w:val="BodyText"/>
-      </w:pPr>
-      <w:r>
-        <w:t xml:space="preserve">These results should be interpreted with caution. The B-S orthogonalization removes not only the predictable component but also potentially some of the genuine policy variation. Moreover, the choice of pre-FOMC controls is necessarily limited by data availability in our sample. The fact that the target shock loses significance for sentiment after orthogonalization while strengthening for returns suggests that the sentiment channel may be more sensitive to predictable components than the direct asset-return channel, but this asymmetry warrants further investigation with richer pre-FOMC control sets.</w:t>
+        <w:t xml:space="preserve">Figure 5: Bauer-Swanson Orthogonalization. Panel (a): sentiment regression — the target shock loses significance after orthogonalization. Panel (b): CRSP VW return regression — the target shock strengthens, suggesting the predictable component attenuates the sentiment relationship but not the asset-return relationship.</w:t>
       </w:r>
     </w:p>
     <w:p>
@@ -7901,7 +7741,7 @@
         <w:t xml:space="preserve"> </w:t>
       </w:r>
       <w:r>
-        <w:t xml:space="preserve">When the conventional interest-rate tool is constrained at the zero lower bound, FOMC statement language appears to become the primary transmission channel for monetary policy. This finding is consistent with the theoretical prediction that forward guidance operates through communication rather than rate changes (Swanson, 2021; Hansen and McMahon, 2016), and provides direct evidence that the informational content of language is regime-dependent. The full-sample weakness of the sentiment channel reflects the averaging of two very different regimes: one in which language is largely redundant with the rate decision, and one in which language is the primary policy signal.</w:t>
+        <w:t xml:space="preserve">When the conventional interest-rate tool is constrained at the zero lower bound, FOMC statement language appears to become the primary transmission channel for monetary policy. This finding is consistent with the theoretical prediction that forward guidance operates through communication rather than rate changes (Swanson, 2021; Hansen and McMahon, 2016), and provides direct evidence that the informational content of language is regime-dependent. The full-sample weakness of the sentiment channel reflects the averaging of two very different regimes: one in which language is largely redundant with the rate decision, and one in which language is the primary policy signal. Figure 6 summarizes these results.</w:t>
       </w:r>
     </w:p>
     <w:p>
@@ -7913,7 +7753,7 @@
           <wp:inline>
             <wp:extent cx="5334000" cy="1683747"/>
             <wp:effectExtent b="0" l="0" r="0" t="0"/>
-            <wp:docPr descr="Figure 6: Sentiment Incremental Explanatory Power. Panel (a) shows the full-sample incremental R^2 from adding sentiment to the shock-only model: marginal significance for S&amp;P 500 (p = 0.088) and 10-year Treasury (p = 0.098). Panel (b) shows the regime-dependent effect: R^2 = 30.6\% in the FG period versus 5.6\% in the non-FG period for CRSP VW returns. Panel (c) shows the scatter plot of sentiment versus CRSP VW returns, with FG-period observations (blue) exhibiting a strong negative relationship and non-FG observations (gray) showing no relationship." title="" id="36" name="Picture"/>
+            <wp:docPr descr="Figure 6: Sentiment Incremental Explanatory Power. Panel (a): full-sample incremental R^2 — marginal significance for S&amp;P 500 and 10-year Treasury. Panel (b): regime-dependent effect — R^2 = 30.6\% in the FG period versus 5.6\% in the non-FG period for CRSP VW returns. Panel (c): scatter plot of sentiment versus CRSP VW returns, with FG-period observations (blue) exhibiting a strong negative relationship and non-FG observations (gray) showing no relationship." title="" id="36" name="Picture"/>
             <a:graphic>
               <a:graphicData uri="http://schemas.openxmlformats.org/drawingml/2006/picture">
                 <pic:pic>
@@ -7956,7 +7796,7 @@
         <w:pStyle w:val="ImageCaption"/>
       </w:pPr>
       <w:r>
-        <w:t xml:space="preserve">Figure 6: Sentiment Incremental Explanatory Power. Panel (a) shows the full-sample incremental</w:t>
+        <w:t xml:space="preserve">Figure 6: Sentiment Incremental Explanatory Power. Panel (a): full-sample incremental</w:t>
       </w:r>
       <w:r>
         <w:t xml:space="preserve"> </w:t>
@@ -7979,41 +7819,7 @@
         <w:t xml:space="preserve"> </w:t>
       </w:r>
       <w:r>
-        <w:t xml:space="preserve">from adding sentiment to the shock-only model: marginal significance for S&amp;P 500 (</w:t>
-      </w:r>
-      <m:oMath>
-        <m:r>
-          <m:t>p</m:t>
-        </m:r>
-        <m:r>
-          <m:rPr>
-            <m:sty m:val="p"/>
-          </m:rPr>
-          <m:t>=</m:t>
-        </m:r>
-        <m:r>
-          <m:t>0.088</m:t>
-        </m:r>
-      </m:oMath>
-      <w:r>
-        <w:t xml:space="preserve">) and 10-year Treasury (</w:t>
-      </w:r>
-      <m:oMath>
-        <m:r>
-          <m:t>p</m:t>
-        </m:r>
-        <m:r>
-          <m:rPr>
-            <m:sty m:val="p"/>
-          </m:rPr>
-          <m:t>=</m:t>
-        </m:r>
-        <m:r>
-          <m:t>0.098</m:t>
-        </m:r>
-      </m:oMath>
-      <w:r>
-        <w:t xml:space="preserve">). Panel (b) shows the regime-dependent effect:</w:t>
+        <w:t xml:space="preserve">— marginal significance for S&amp;P 500 and 10-year Treasury. Panel (b): regime-dependent effect —</w:t>
       </w:r>
       <w:r>
         <w:t xml:space="preserve"> </w:t>
@@ -8071,7 +7877,7 @@
         <w:t xml:space="preserve"> </w:t>
       </w:r>
       <w:r>
-        <w:t xml:space="preserve">in the non-FG period for CRSP VW returns. Panel (c) shows the scatter plot of sentiment versus CRSP VW returns, with FG-period observations (blue) exhibiting a strong negative relationship and non-FG observations (gray) showing no relationship.</w:t>
+        <w:t xml:space="preserve">in the non-FG period for CRSP VW returns. Panel (c): scatter plot of sentiment versus CRSP VW returns, with FG-period observations (blue) exhibiting a strong negative relationship and non-FG observations (gray) showing no relationship.</w:t>
       </w:r>
     </w:p>
     <w:p>

</xml_diff>

<commit_message>
fix: all 6 figures + Table 6 now have self-contained Notes (SE method, sample, units, significance)
</commit_message>
<xml_diff>
--- a/presentation_v10.3/Words_Beyond_the_Rate_v10.3_updated.docx
+++ b/presentation_v10.3/Words_Beyond_the_Rate_v10.3_updated.docx
@@ -2984,6 +2984,18 @@
         <w:pStyle w:val="BodyText"/>
       </w:pPr>
       <w:r>
+        <w:rPr>
+          <w:i/>
+          <w:iCs/>
+        </w:rPr>
+        <w:t xml:space="preserve">Note: Scatter plot of FOMC statement sentiment against target shock (left panel) and path shock (right panel). Sentiment = combined score (0.5 × LM + 0.5 × CB). Shocks from Acosta (2022), standardized to unit variance. Fit line from bivariate OLS. Sample: 117 FOMC meetings, 2006–2022.</w:t>
+      </w:r>
+    </w:p>
+    <w:p>
+      <w:pPr>
+        <w:pStyle w:val="BodyText"/>
+      </w:pPr>
+      <w:r>
         <w:t xml:space="preserve">Figure 2 illustrates the relationship between sentiment and monetary policy shocks. The target shock exhibits a visibly positive, though noisy, relationship with statement sentiment, while the path-shock relationship appears substantially weaker.</w:t>
       </w:r>
     </w:p>
@@ -4324,6 +4336,18 @@
         <w:pStyle w:val="BodyText"/>
       </w:pPr>
       <w:r>
+        <w:rPr>
+          <w:i/>
+          <w:iCs/>
+        </w:rPr>
+        <w:t xml:space="preserve">Note: Coefficients from regressing each asset return on target and path shocks (Equation 2). Newey-West HAC(4) standard errors. Returns in basis points for equities and gold; percentage points for Treasury yields. Sample: 117 FOMC meetings, 2006–2022. *** p&lt;0.01, ** p&lt;0.05, * p&lt;0.1.</w:t>
+      </w:r>
+    </w:p>
+    <w:p>
+      <w:pPr>
+        <w:pStyle w:val="BodyText"/>
+      </w:pPr>
+      <w:r>
         <w:t xml:space="preserve">Figure 3 summarizes the cross-asset responses. The target shock generates consistently negative responses across equity markets and gold, while path-shock effects remain comparatively limited.</w:t>
       </w:r>
     </w:p>
@@ -5848,6 +5872,102 @@
         </w:tc>
       </w:tr>
     </w:tbl>
+    <w:p>
+      <w:pPr>
+        <w:pStyle w:val="BodyText"/>
+      </w:pPr>
+      <w:r>
+        <w:rPr>
+          <w:i/>
+          <w:iCs/>
+        </w:rPr>
+        <w:t xml:space="preserve">Note: Newey-West HAC(4) standard errors. Dependent variable is the sentiment score indicated in the Model column. Combined sentiment = 0.5 × LM + 0.5 × CB.</w:t>
+      </w:r>
+      <w:r>
+        <w:rPr>
+          <w:i/>
+          <w:iCs/>
+        </w:rPr>
+        <w:t xml:space="preserve"> </w:t>
+      </w:r>
+      <w:r>
+        <w:rPr>
+          <w:i/>
+          <w:iCs/>
+        </w:rPr>
+        <w:t xml:space="preserve">“</w:t>
+      </w:r>
+      <w:r>
+        <w:rPr>
+          <w:i/>
+          <w:iCs/>
+        </w:rPr>
+        <w:t xml:space="preserve">Statement</w:t>
+      </w:r>
+      <w:r>
+        <w:rPr>
+          <w:i/>
+          <w:iCs/>
+        </w:rPr>
+        <w:t xml:space="preserve">”</w:t>
+      </w:r>
+      <w:r>
+        <w:rPr>
+          <w:i/>
+          <w:iCs/>
+        </w:rPr>
+        <w:t xml:space="preserve"> </w:t>
+      </w:r>
+      <w:r>
+        <w:rPr>
+          <w:i/>
+          <w:iCs/>
+        </w:rPr>
+        <w:t xml:space="preserve">= FOMC post-meeting statement;</w:t>
+      </w:r>
+      <w:r>
+        <w:rPr>
+          <w:i/>
+          <w:iCs/>
+        </w:rPr>
+        <w:t xml:space="preserve"> </w:t>
+      </w:r>
+      <w:r>
+        <w:rPr>
+          <w:i/>
+          <w:iCs/>
+        </w:rPr>
+        <w:t xml:space="preserve">“</w:t>
+      </w:r>
+      <w:r>
+        <w:rPr>
+          <w:i/>
+          <w:iCs/>
+        </w:rPr>
+        <w:t xml:space="preserve">Minutes</w:t>
+      </w:r>
+      <w:r>
+        <w:rPr>
+          <w:i/>
+          <w:iCs/>
+        </w:rPr>
+        <w:t xml:space="preserve">”</w:t>
+      </w:r>
+      <w:r>
+        <w:rPr>
+          <w:i/>
+          <w:iCs/>
+        </w:rPr>
+        <w:t xml:space="preserve"> </w:t>
+      </w:r>
+      <w:r>
+        <w:rPr>
+          <w:i/>
+          <w:iCs/>
+        </w:rPr>
+        <w:t xml:space="preserve">= FOMC minutes released 3 weeks after the meeting. Sample: 117 FOMC meetings, 2006–2022. *** p&lt;0.01, ** p&lt;0.05, * p&lt;0.1.</w:t>
+      </w:r>
+    </w:p>
     <w:p>
       <w:pPr>
         <w:pStyle w:val="BodyText"/>
@@ -6328,7 +6448,7 @@
           <wp:inline>
             <wp:extent cx="5334000" cy="1906281"/>
             <wp:effectExtent b="0" l="0" r="0" t="0"/>
-            <wp:docPr descr="Figure 4: Jarociński-Karadi Sign-Restriction Decomposition. Panel (a): sentiment regression — neither the MP nor CBI component is individually significant. Panel (b): CRSP VW return regression — both components are highly significant with opposite signs, confirming the information effect in asset markets but not in statement sentiment." title="" id="30" name="Picture"/>
+            <wp:docPr descr="Figure 4: Jarociński-Karadi Sign-Restriction Decomposition" title="" id="30" name="Picture"/>
             <a:graphic>
               <a:graphicData uri="http://schemas.openxmlformats.org/drawingml/2006/picture">
                 <pic:pic>
@@ -6371,7 +6491,19 @@
         <w:pStyle w:val="ImageCaption"/>
       </w:pPr>
       <w:r>
-        <w:t xml:space="preserve">Figure 4: Jarociński-Karadi Sign-Restriction Decomposition. Panel (a): sentiment regression — neither the MP nor CBI component is individually significant. Panel (b): CRSP VW return regression — both components are highly significant with opposite signs, confirming the information effect in asset markets but not in statement sentiment.</w:t>
+        <w:t xml:space="preserve">Figure 4: Jarociński-Karadi Sign-Restriction Decomposition</w:t>
+      </w:r>
+    </w:p>
+    <w:p>
+      <w:pPr>
+        <w:pStyle w:val="BodyText"/>
+      </w:pPr>
+      <w:r>
+        <w:rPr>
+          <w:i/>
+          <w:iCs/>
+        </w:rPr>
+        <w:t xml:space="preserve">Note: Panel (a): sentiment regressed on MP and CBI components of the target shock plus the path shock. Panel (b): CRSP VW return regressed on the same. MP = pure monetary policy shock (contractionary rate surprise with negative equity response); CBI = central bank information shock (rate surprise with positive equity response), following Jarociński and Karadi (2020). Newey-West HAC(4) standard errors. Sample: 117 FOMC meetings, 2006–2022. *** p&lt;0.01, ** p&lt;0.05, * p&lt;0.1.</w:t>
       </w:r>
     </w:p>
     <w:p>
@@ -6612,7 +6744,7 @@
           <wp:inline>
             <wp:extent cx="5334000" cy="1906281"/>
             <wp:effectExtent b="0" l="0" r="0" t="0"/>
-            <wp:docPr descr="Figure 5: Bauer-Swanson Orthogonalization. Panel (a): sentiment regression — the target shock loses significance after orthogonalization. Panel (b): CRSP VW return regression — the target shock strengthens, suggesting the predictable component attenuates the sentiment relationship but not the asset-return relationship." title="" id="33" name="Picture"/>
+            <wp:docPr descr="Figure 5: Bauer-Swanson Orthogonalization" title="" id="33" name="Picture"/>
             <a:graphic>
               <a:graphicData uri="http://schemas.openxmlformats.org/drawingml/2006/picture">
                 <pic:pic>
@@ -6655,7 +6787,19 @@
         <w:pStyle w:val="ImageCaption"/>
       </w:pPr>
       <w:r>
-        <w:t xml:space="preserve">Figure 5: Bauer-Swanson Orthogonalization. Panel (a): sentiment regression — the target shock loses significance after orthogonalization. Panel (b): CRSP VW return regression — the target shock strengthens, suggesting the predictable component attenuates the sentiment relationship but not the asset-return relationship.</w:t>
+        <w:t xml:space="preserve">Figure 5: Bauer-Swanson Orthogonalization</w:t>
+      </w:r>
+    </w:p>
+    <w:p>
+      <w:pPr>
+        <w:pStyle w:val="BodyText"/>
+      </w:pPr>
+      <w:r>
+        <w:rPr>
+          <w:i/>
+          <w:iCs/>
+        </w:rPr>
+        <w:t xml:space="preserve">Note: Panel (a): sentiment regressed on original vs. B-S orthogonalized shocks. Panel (b): CRSP VW return regressed on the same. Orthogonalized shocks are residuals from regressing each shock on pre-FOMC information (lagged equity returns, VIX, term spread, recent rate changes). Newey-West HAC(4) standard errors. Sample: 117 FOMC meetings, 2006–2022. *** p&lt;0.01, ** p&lt;0.05, * p&lt;0.1.</w:t>
       </w:r>
     </w:p>
     <w:p>
@@ -7753,7 +7897,7 @@
           <wp:inline>
             <wp:extent cx="5334000" cy="1683747"/>
             <wp:effectExtent b="0" l="0" r="0" t="0"/>
-            <wp:docPr descr="Figure 6: Sentiment Incremental Explanatory Power. Panel (a): full-sample incremental R^2 — marginal significance for S&amp;P 500 and 10-year Treasury. Panel (b): regime-dependent effect — R^2 = 30.6\% in the FG period versus 5.6\% in the non-FG period for CRSP VW returns. Panel (c): scatter plot of sentiment versus CRSP VW returns, with FG-period observations (blue) exhibiting a strong negative relationship and non-FG observations (gray) showing no relationship." title="" id="36" name="Picture"/>
+            <wp:docPr descr="Figure 6: Sentiment Incremental Explanatory Power" title="" id="36" name="Picture"/>
             <a:graphic>
               <a:graphicData uri="http://schemas.openxmlformats.org/drawingml/2006/picture">
                 <pic:pic>
@@ -7796,9 +7940,25 @@
         <w:pStyle w:val="ImageCaption"/>
       </w:pPr>
       <w:r>
-        <w:t xml:space="preserve">Figure 6: Sentiment Incremental Explanatory Power. Panel (a): full-sample incremental</w:t>
-      </w:r>
-      <w:r>
+        <w:t xml:space="preserve">Figure 6: Sentiment Incremental Explanatory Power</w:t>
+      </w:r>
+    </w:p>
+    <w:p>
+      <w:pPr>
+        <w:pStyle w:val="BodyText"/>
+      </w:pPr>
+      <w:r>
+        <w:rPr>
+          <w:i/>
+          <w:iCs/>
+        </w:rPr>
+        <w:t xml:space="preserve">Note: Panel (a): incremental</w:t>
+      </w:r>
+      <w:r>
+        <w:rPr>
+          <w:i/>
+          <w:iCs/>
+        </w:rPr>
         <w:t xml:space="preserve"> </w:t>
       </w:r>
       <m:oMath>
@@ -7816,12 +7976,24 @@
         </m:sSup>
       </m:oMath>
       <w:r>
+        <w:rPr>
+          <w:i/>
+          <w:iCs/>
+        </w:rPr>
         <w:t xml:space="preserve"> </w:t>
       </w:r>
       <w:r>
-        <w:t xml:space="preserve">— marginal significance for S&amp;P 500 and 10-year Treasury. Panel (b): regime-dependent effect —</w:t>
-      </w:r>
-      <w:r>
+        <w:rPr>
+          <w:i/>
+          <w:iCs/>
+        </w:rPr>
+        <w:t xml:space="preserve">from adding sentiment to a shocks-only model (Equation 7). Panel (b): full-model</w:t>
+      </w:r>
+      <w:r>
+        <w:rPr>
+          <w:i/>
+          <w:iCs/>
+        </w:rPr>
         <w:t xml:space="preserve"> </w:t>
       </w:r>
       <m:oMath>
@@ -7837,47 +8009,20 @@
             </m:r>
           </m:sup>
         </m:sSup>
-        <m:r>
-          <m:rPr>
-            <m:sty m:val="p"/>
-          </m:rPr>
-          <m:t>=</m:t>
-        </m:r>
-        <m:r>
-          <m:t>30.6</m:t>
-        </m:r>
-        <m:r>
-          <m:rPr>
-            <m:sty m:val="p"/>
-          </m:rPr>
-          <m:t>%</m:t>
-        </m:r>
       </m:oMath>
       <w:r>
+        <w:rPr>
+          <w:i/>
+          <w:iCs/>
+        </w:rPr>
         <w:t xml:space="preserve"> </w:t>
       </w:r>
       <w:r>
-        <w:t xml:space="preserve">in the FG period versus</w:t>
-      </w:r>
-      <w:r>
-        <w:t xml:space="preserve"> </w:t>
-      </w:r>
-      <m:oMath>
-        <m:r>
-          <m:t>5.6</m:t>
-        </m:r>
-        <m:r>
-          <m:rPr>
-            <m:sty m:val="p"/>
-          </m:rPr>
-          <m:t>%</m:t>
-        </m:r>
-      </m:oMath>
-      <w:r>
-        <w:t xml:space="preserve"> </w:t>
-      </w:r>
-      <w:r>
-        <w:t xml:space="preserve">in the non-FG period for CRSP VW returns. Panel (c): scatter plot of sentiment versus CRSP VW returns, with FG-period observations (blue) exhibiting a strong negative relationship and non-FG observations (gray) showing no relationship.</w:t>
+        <w:rPr>
+          <w:i/>
+          <w:iCs/>
+        </w:rPr>
+        <w:t xml:space="preserve">by regime, where FG = forward guidance period (Dec 2008–Dec 2015, N=57) and Non-FG = remaining meetings (N=60). Panel (c): scatter plot of statement sentiment vs. CRSP VW return with regime-specific fit lines. All models include target and path shocks as controls. Newey-West HAC(4) standard errors. Sample: 117 FOMC meetings, 2006–2022. *** p&lt;0.01, ** p&lt;0.05, * p&lt;0.1.</w:t>
       </w:r>
     </w:p>
     <w:p>

</xml_diff>